<commit_message>
release: data-pack v1.0.0 — legal slice frozen
Canonical post-fix DOCX builds for all 39 documents, intake reference
handshake (INT-2026-0433), manifest and changelog for the tagged release.

Co-Authored-By: Claude Fable 5 <noreply@anthropic.com>
Claude-Session: https://claude.ai/code/session_01SGQ4HhQK6XtEFiFWK4NDMw
</commit_message>
<xml_diff>
--- a/artifacts/CORE-01/build/master-services-agreement-20k.docx
+++ b/artifacts/CORE-01/build/master-services-agreement-20k.docx
@@ -8,15 +8,6 @@
         <w:pStyle w:val="Heading1"/>
       </w:pPr>
       <w:r>
-        <w:rPr>
-          <w:rStyle w:val="SectionNumber"/>
-        </w:rPr>
-        <w:t xml:space="preserve">1</w:t>
-      </w:r>
-      <w:r>
-        <w:tab/>
-      </w:r>
-      <w:r>
         <w:t xml:space="preserve">Master Services Agreement</w:t>
       </w:r>
     </w:p>
@@ -199,15 +190,6 @@
       <w:pPr>
         <w:pStyle w:val="Heading2"/>
       </w:pPr>
-      <w:r>
-        <w:rPr>
-          <w:rStyle w:val="SectionNumber"/>
-        </w:rPr>
-        <w:t xml:space="preserve">1.1</w:t>
-      </w:r>
-      <w:r>
-        <w:tab/>
-      </w:r>
       <w:r>
         <w:t xml:space="preserve">Recitals</w:t>
       </w:r>
@@ -288,15 +270,6 @@
         <w:pStyle w:val="Heading2"/>
       </w:pPr>
       <w:r>
-        <w:rPr>
-          <w:rStyle w:val="SectionNumber"/>
-        </w:rPr>
-        <w:t xml:space="preserve">1.2</w:t>
-      </w:r>
-      <w:r>
-        <w:tab/>
-      </w:r>
-      <w:r>
         <w:t xml:space="preserve">1. Term and Renewal</w:t>
       </w:r>
     </w:p>
@@ -488,15 +461,6 @@
         <w:pStyle w:val="Heading2"/>
       </w:pPr>
       <w:r>
-        <w:rPr>
-          <w:rStyle w:val="SectionNumber"/>
-        </w:rPr>
-        <w:t xml:space="preserve">1.3</w:t>
-      </w:r>
-      <w:r>
-        <w:tab/>
-      </w:r>
-      <w:r>
         <w:t xml:space="preserve">2. Subscription Services and Professional Services</w:t>
       </w:r>
     </w:p>
@@ -634,15 +598,6 @@
         <w:pStyle w:val="Heading2"/>
       </w:pPr>
       <w:r>
-        <w:rPr>
-          <w:rStyle w:val="SectionNumber"/>
-        </w:rPr>
-        <w:t xml:space="preserve">1.4</w:t>
-      </w:r>
-      <w:r>
-        <w:tab/>
-      </w:r>
-      <w:r>
         <w:t xml:space="preserve">3. Customer Responsibilities and Restrictions</w:t>
       </w:r>
     </w:p>
@@ -725,15 +680,6 @@
         <w:pStyle w:val="Heading2"/>
       </w:pPr>
       <w:r>
-        <w:rPr>
-          <w:rStyle w:val="SectionNumber"/>
-        </w:rPr>
-        <w:t xml:space="preserve">1.5</w:t>
-      </w:r>
-      <w:r>
-        <w:tab/>
-      </w:r>
-      <w:r>
         <w:t xml:space="preserve">4. Implementation, Milestones, and Acceptance</w:t>
       </w:r>
     </w:p>
@@ -872,15 +818,6 @@
         <w:pStyle w:val="Heading2"/>
       </w:pPr>
       <w:r>
-        <w:rPr>
-          <w:rStyle w:val="SectionNumber"/>
-        </w:rPr>
-        <w:t xml:space="preserve">1.6</w:t>
-      </w:r>
-      <w:r>
-        <w:tab/>
-      </w:r>
-      <w:r>
         <w:t xml:space="preserve">5. Fees, Invoicing, and Payment</w:t>
       </w:r>
     </w:p>
@@ -1119,15 +1056,6 @@
         <w:pStyle w:val="Heading2"/>
       </w:pPr>
       <w:r>
-        <w:rPr>
-          <w:rStyle w:val="SectionNumber"/>
-        </w:rPr>
-        <w:t xml:space="preserve">1.7</w:t>
-      </w:r>
-      <w:r>
-        <w:tab/>
-      </w:r>
-      <w:r>
         <w:t xml:space="preserve">6. Limitation of Liability</w:t>
       </w:r>
     </w:p>
@@ -1250,15 +1178,6 @@
       <w:pPr>
         <w:pStyle w:val="Heading2"/>
       </w:pPr>
-      <w:r>
-        <w:rPr>
-          <w:rStyle w:val="SectionNumber"/>
-        </w:rPr>
-        <w:t xml:space="preserve">1.8</w:t>
-      </w:r>
-      <w:r>
-        <w:tab/>
-      </w:r>
       <w:r>
         <w:t xml:space="preserve">7. Termination</w:t>
       </w:r>
@@ -1393,15 +1312,6 @@
         <w:pStyle w:val="Heading2"/>
       </w:pPr>
       <w:r>
-        <w:rPr>
-          <w:rStyle w:val="SectionNumber"/>
-        </w:rPr>
-        <w:t xml:space="preserve">1.9</w:t>
-      </w:r>
-      <w:r>
-        <w:tab/>
-      </w:r>
-      <w:r>
         <w:t xml:space="preserve">8. Indemnification</w:t>
       </w:r>
     </w:p>
@@ -1608,15 +1518,6 @@
         <w:pStyle w:val="Heading2"/>
       </w:pPr>
       <w:r>
-        <w:rPr>
-          <w:rStyle w:val="SectionNumber"/>
-        </w:rPr>
-        <w:t xml:space="preserve">1.10</w:t>
-      </w:r>
-      <w:r>
-        <w:tab/>
-      </w:r>
-      <w:r>
         <w:t xml:space="preserve">9. Data Protection and Security</w:t>
       </w:r>
     </w:p>
@@ -1801,15 +1702,6 @@
         <w:pStyle w:val="Heading2"/>
       </w:pPr>
       <w:r>
-        <w:rPr>
-          <w:rStyle w:val="SectionNumber"/>
-        </w:rPr>
-        <w:t xml:space="preserve">1.11</w:t>
-      </w:r>
-      <w:r>
-        <w:tab/>
-      </w:r>
-      <w:r>
         <w:t xml:space="preserve">10. Confidentiality</w:t>
       </w:r>
     </w:p>
@@ -1981,15 +1873,6 @@
       <w:pPr>
         <w:pStyle w:val="Heading2"/>
       </w:pPr>
-      <w:r>
-        <w:rPr>
-          <w:rStyle w:val="SectionNumber"/>
-        </w:rPr>
-        <w:t xml:space="preserve">1.12</w:t>
-      </w:r>
-      <w:r>
-        <w:tab/>
-      </w:r>
       <w:r>
         <w:t xml:space="preserve">11. Insurance</w:t>
       </w:r>
@@ -2117,15 +2000,6 @@
         <w:pStyle w:val="Heading2"/>
       </w:pPr>
       <w:r>
-        <w:rPr>
-          <w:rStyle w:val="SectionNumber"/>
-        </w:rPr>
-        <w:t xml:space="preserve">1.13</w:t>
-      </w:r>
-      <w:r>
-        <w:tab/>
-      </w:r>
-      <w:r>
         <w:t xml:space="preserve">12. Intellectual Property</w:t>
       </w:r>
     </w:p>
@@ -2227,15 +2101,6 @@
         <w:pStyle w:val="Heading2"/>
       </w:pPr>
       <w:r>
-        <w:rPr>
-          <w:rStyle w:val="SectionNumber"/>
-        </w:rPr>
-        <w:t xml:space="preserve">1.14</w:t>
-      </w:r>
-      <w:r>
-        <w:tab/>
-      </w:r>
-      <w:r>
         <w:t xml:space="preserve">13. Representations, Warranties, and Disclaimer</w:t>
       </w:r>
     </w:p>
@@ -2318,15 +2183,6 @@
         <w:pStyle w:val="Heading2"/>
       </w:pPr>
       <w:r>
-        <w:rPr>
-          <w:rStyle w:val="SectionNumber"/>
-        </w:rPr>
-        <w:t xml:space="preserve">1.15</w:t>
-      </w:r>
-      <w:r>
-        <w:tab/>
-      </w:r>
-      <w:r>
         <w:t xml:space="preserve">14. Compliance with Laws</w:t>
       </w:r>
     </w:p>
@@ -2409,15 +2265,6 @@
         <w:pStyle w:val="Heading2"/>
       </w:pPr>
       <w:r>
-        <w:rPr>
-          <w:rStyle w:val="SectionNumber"/>
-        </w:rPr>
-        <w:t xml:space="preserve">1.16</w:t>
-      </w:r>
-      <w:r>
-        <w:tab/>
-      </w:r>
-      <w:r>
         <w:t xml:space="preserve">15. Personnel, Subcontractors, and Non-Solicitation</w:t>
       </w:r>
     </w:p>
@@ -2500,15 +2347,6 @@
         <w:pStyle w:val="Heading2"/>
       </w:pPr>
       <w:r>
-        <w:rPr>
-          <w:rStyle w:val="SectionNumber"/>
-        </w:rPr>
-        <w:t xml:space="preserve">1.17</w:t>
-      </w:r>
-      <w:r>
-        <w:tab/>
-      </w:r>
-      <w:r>
         <w:t xml:space="preserve">16. Audit and Records</w:t>
       </w:r>
     </w:p>
@@ -2591,15 +2429,6 @@
         <w:pStyle w:val="Heading2"/>
       </w:pPr>
       <w:r>
-        <w:rPr>
-          <w:rStyle w:val="SectionNumber"/>
-        </w:rPr>
-        <w:t xml:space="preserve">1.18</w:t>
-      </w:r>
-      <w:r>
-        <w:tab/>
-      </w:r>
-      <w:r>
         <w:t xml:space="preserve">17. Force Majeure</w:t>
       </w:r>
     </w:p>
@@ -2665,15 +2494,6 @@
         <w:pStyle w:val="Heading2"/>
       </w:pPr>
       <w:r>
-        <w:rPr>
-          <w:rStyle w:val="SectionNumber"/>
-        </w:rPr>
-        <w:t xml:space="preserve">1.19</w:t>
-      </w:r>
-      <w:r>
-        <w:tab/>
-      </w:r>
-      <w:r>
         <w:t xml:space="preserve">18. Notices</w:t>
       </w:r>
     </w:p>
@@ -2862,15 +2682,6 @@
         <w:pStyle w:val="Heading2"/>
       </w:pPr>
       <w:r>
-        <w:rPr>
-          <w:rStyle w:val="SectionNumber"/>
-        </w:rPr>
-        <w:t xml:space="preserve">1.20</w:t>
-      </w:r>
-      <w:r>
-        <w:tab/>
-      </w:r>
-      <w:r>
         <w:t xml:space="preserve">19. Governing Law and Dispute Resolution</w:t>
       </w:r>
     </w:p>
@@ -2971,15 +2782,6 @@
         <w:pStyle w:val="Heading2"/>
       </w:pPr>
       <w:r>
-        <w:rPr>
-          <w:rStyle w:val="SectionNumber"/>
-        </w:rPr>
-        <w:t xml:space="preserve">1.21</w:t>
-      </w:r>
-      <w:r>
-        <w:tab/>
-      </w:r>
-      <w:r>
         <w:t xml:space="preserve">20. General Provisions</w:t>
       </w:r>
     </w:p>
@@ -3194,15 +2996,6 @@
         <w:pStyle w:val="Heading2"/>
       </w:pPr>
       <w:r>
-        <w:rPr>
-          <w:rStyle w:val="SectionNumber"/>
-        </w:rPr>
-        <w:t xml:space="preserve">1.22</w:t>
-      </w:r>
-      <w:r>
-        <w:tab/>
-      </w:r>
-      <w:r>
         <w:t xml:space="preserve">21. Definitions</w:t>
       </w:r>
     </w:p>
@@ -3511,15 +3304,6 @@
         <w:pStyle w:val="Heading2"/>
       </w:pPr>
       <w:r>
-        <w:rPr>
-          <w:rStyle w:val="SectionNumber"/>
-        </w:rPr>
-        <w:t xml:space="preserve">1.23</w:t>
-      </w:r>
-      <w:r>
-        <w:tab/>
-      </w:r>
-      <w:r>
         <w:t xml:space="preserve">Exhibit A — Fees and Payment Schedule</w:t>
       </w:r>
     </w:p>
@@ -3528,15 +3312,6 @@
       <w:pPr>
         <w:pStyle w:val="Heading3"/>
       </w:pPr>
-      <w:r>
-        <w:rPr>
-          <w:rStyle w:val="SectionNumber"/>
-        </w:rPr>
-        <w:t xml:space="preserve">1.23.1</w:t>
-      </w:r>
-      <w:r>
-        <w:tab/>
-      </w:r>
       <w:r>
         <w:t xml:space="preserve">A.1 Subscription</w:t>
       </w:r>
@@ -3818,15 +3593,6 @@
       <w:pPr>
         <w:pStyle w:val="Heading3"/>
       </w:pPr>
-      <w:r>
-        <w:rPr>
-          <w:rStyle w:val="SectionNumber"/>
-        </w:rPr>
-        <w:t xml:space="preserve">1.23.2</w:t>
-      </w:r>
-      <w:r>
-        <w:tab/>
-      </w:r>
       <w:r>
         <w:t xml:space="preserve">A.2 Professional Services</w:t>
       </w:r>
@@ -4133,15 +3899,6 @@
         <w:pStyle w:val="Heading3"/>
       </w:pPr>
       <w:r>
-        <w:rPr>
-          <w:rStyle w:val="SectionNumber"/>
-        </w:rPr>
-        <w:t xml:space="preserve">1.23.3</w:t>
-      </w:r>
-      <w:r>
-        <w:tab/>
-      </w:r>
-      <w:r>
         <w:t xml:space="preserve">A.3 Total Contract Value</w:t>
       </w:r>
     </w:p>
@@ -4269,15 +4026,6 @@
       <w:pPr>
         <w:pStyle w:val="Heading3"/>
       </w:pPr>
-      <w:r>
-        <w:rPr>
-          <w:rStyle w:val="SectionNumber"/>
-        </w:rPr>
-        <w:t xml:space="preserve">1.23.4</w:t>
-      </w:r>
-      <w:r>
-        <w:tab/>
-      </w:r>
       <w:r>
         <w:t xml:space="preserve">A.4 Rates and Overage</w:t>
       </w:r>
@@ -4448,15 +4196,6 @@
         <w:pStyle w:val="Heading3"/>
       </w:pPr>
       <w:r>
-        <w:rPr>
-          <w:rStyle w:val="SectionNumber"/>
-        </w:rPr>
-        <w:t xml:space="preserve">1.23.5</w:t>
-      </w:r>
-      <w:r>
-        <w:tab/>
-      </w:r>
-      <w:r>
         <w:t xml:space="preserve">A.5 Renewal Pricing</w:t>
       </w:r>
     </w:p>
@@ -4489,15 +4228,6 @@
         <w:pStyle w:val="Heading2"/>
       </w:pPr>
       <w:r>
-        <w:rPr>
-          <w:rStyle w:val="SectionNumber"/>
-        </w:rPr>
-        <w:t xml:space="preserve">1.24</w:t>
-      </w:r>
-      <w:r>
-        <w:tab/>
-      </w:r>
-      <w:r>
         <w:t xml:space="preserve">Exhibit B — Implementation Plan and Milestones</w:t>
       </w:r>
     </w:p>
@@ -4506,15 +4236,6 @@
       <w:pPr>
         <w:pStyle w:val="Heading3"/>
       </w:pPr>
-      <w:r>
-        <w:rPr>
-          <w:rStyle w:val="SectionNumber"/>
-        </w:rPr>
-        <w:t xml:space="preserve">1.24.1</w:t>
-      </w:r>
-      <w:r>
-        <w:tab/>
-      </w:r>
       <w:r>
         <w:t xml:space="preserve">B.1 Phases and Milestones</w:t>
       </w:r>
@@ -4657,15 +4378,6 @@
       <w:pPr>
         <w:pStyle w:val="Heading3"/>
       </w:pPr>
-      <w:r>
-        <w:rPr>
-          <w:rStyle w:val="SectionNumber"/>
-        </w:rPr>
-        <w:t xml:space="preserve">1.24.2</w:t>
-      </w:r>
-      <w:r>
-        <w:tab/>
-      </w:r>
       <w:r>
         <w:t xml:space="preserve">B.2 Provider Key Personnel</w:t>
       </w:r>
@@ -4833,15 +4545,6 @@
         <w:pStyle w:val="Heading3"/>
       </w:pPr>
       <w:r>
-        <w:rPr>
-          <w:rStyle w:val="SectionNumber"/>
-        </w:rPr>
-        <w:t xml:space="preserve">1.24.3</w:t>
-      </w:r>
-      <w:r>
-        <w:tab/>
-      </w:r>
-      <w:r>
         <w:t xml:space="preserve">B.3 Scope and Customer Dependencies</w:t>
       </w:r>
     </w:p>
@@ -4876,15 +4579,6 @@
       <w:pPr>
         <w:pStyle w:val="Heading2"/>
       </w:pPr>
-      <w:r>
-        <w:rPr>
-          <w:rStyle w:val="SectionNumber"/>
-        </w:rPr>
-        <w:t xml:space="preserve">1.25</w:t>
-      </w:r>
-      <w:r>
-        <w:tab/>
-      </w:r>
       <w:r>
         <w:t xml:space="preserve">Exhibit C — Data Processing Addendum (Summary and Incorporation)</w:t>
       </w:r>
@@ -5022,15 +4716,6 @@
         <w:pStyle w:val="Heading2"/>
       </w:pPr>
       <w:r>
-        <w:rPr>
-          <w:rStyle w:val="SectionNumber"/>
-        </w:rPr>
-        <w:t xml:space="preserve">1.26</w:t>
-      </w:r>
-      <w:r>
-        <w:tab/>
-      </w:r>
-      <w:r>
         <w:t xml:space="preserve">Exhibit D — Support and Service Levels</w:t>
       </w:r>
     </w:p>
@@ -5039,15 +4724,6 @@
       <w:pPr>
         <w:pStyle w:val="Heading3"/>
       </w:pPr>
-      <w:r>
-        <w:rPr>
-          <w:rStyle w:val="SectionNumber"/>
-        </w:rPr>
-        <w:t xml:space="preserve">1.26.1</w:t>
-      </w:r>
-      <w:r>
-        <w:tab/>
-      </w:r>
       <w:r>
         <w:t xml:space="preserve">D.1 Availability</w:t>
       </w:r>
@@ -5082,15 +4758,6 @@
       <w:pPr>
         <w:pStyle w:val="Heading3"/>
       </w:pPr>
-      <w:r>
-        <w:rPr>
-          <w:rStyle w:val="SectionNumber"/>
-        </w:rPr>
-        <w:t xml:space="preserve">1.26.2</w:t>
-      </w:r>
-      <w:r>
-        <w:tab/>
-      </w:r>
       <w:r>
         <w:t xml:space="preserve">D.2 Service Credits</w:t>
       </w:r>
@@ -5244,15 +4911,6 @@
       <w:pPr>
         <w:pStyle w:val="Heading3"/>
       </w:pPr>
-      <w:r>
-        <w:rPr>
-          <w:rStyle w:val="SectionNumber"/>
-        </w:rPr>
-        <w:t xml:space="preserve">1.26.3</w:t>
-      </w:r>
-      <w:r>
-        <w:tab/>
-      </w:r>
       <w:r>
         <w:t xml:space="preserve">D.3 Support Response Targets</w:t>
       </w:r>
@@ -5511,15 +5169,6 @@
         <w:pStyle w:val="Heading3"/>
       </w:pPr>
       <w:r>
-        <w:rPr>
-          <w:rStyle w:val="SectionNumber"/>
-        </w:rPr>
-        <w:t xml:space="preserve">1.26.4</w:t>
-      </w:r>
-      <w:r>
-        <w:tab/>
-      </w:r>
-      <w:r>
         <w:t xml:space="preserve">D.4 Business Continuity</w:t>
       </w:r>
     </w:p>
@@ -5538,15 +5187,6 @@
       <w:pPr>
         <w:pStyle w:val="Heading2"/>
       </w:pPr>
-      <w:r>
-        <w:rPr>
-          <w:rStyle w:val="SectionNumber"/>
-        </w:rPr>
-        <w:t xml:space="preserve">1.27</w:t>
-      </w:r>
-      <w:r>
-        <w:tab/>
-      </w:r>
       <w:r>
         <w:t xml:space="preserve">Exhibit E — Approved Subprocessors</w:t>
       </w:r>
@@ -5756,15 +5396,6 @@
       <w:pPr>
         <w:pStyle w:val="Heading2"/>
       </w:pPr>
-      <w:r>
-        <w:rPr>
-          <w:rStyle w:val="SectionNumber"/>
-        </w:rPr>
-        <w:t xml:space="preserve">1.28</w:t>
-      </w:r>
-      <w:r>
-        <w:tab/>
-      </w:r>
       <w:r>
         <w:t xml:space="preserve">Signature Page</w:t>
       </w:r>

</xml_diff>